<commit_message>
Added CODEOWNERS File and added some configurations scripts
</commit_message>
<xml_diff>
--- a/docs/Group6_ProjectProposal.docx
+++ b/docs/Group6_ProjectProposal.docx
@@ -339,7 +339,16 @@
           <w:szCs w:val="28"/>
           <w:u w:val="single"/>
         </w:rPr>
-        <w:t xml:space="preserve">C++ </w:t>
+        <w:t>Java</w:t>
+      </w:r>
+      <w:r>
+        <w:rPr>
+          <w:b/>
+          <w:sz w:val="28"/>
+          <w:szCs w:val="28"/>
+          <w:u w:val="single"/>
+        </w:rPr>
+        <w:t xml:space="preserve"> </w:t>
       </w:r>
     </w:p>
     <w:p>
@@ -597,15 +606,24 @@
           <w:sz w:val="24"/>
           <w:szCs w:val="24"/>
         </w:rPr>
-        <w:t xml:space="preserve">will be developed using </w:t>
-      </w:r>
-      <w:r>
-        <w:rPr>
-          <w:b/>
-          <w:sz w:val="24"/>
-          <w:szCs w:val="24"/>
-        </w:rPr>
-        <w:t xml:space="preserve">Java Script as backend </w:t>
+        <w:t>will be dev</w:t>
+      </w:r>
+      <w:bookmarkStart w:id="0" w:name="_GoBack"/>
+      <w:bookmarkEnd w:id="0"/>
+      <w:r>
+        <w:rPr>
+          <w:sz w:val="24"/>
+          <w:szCs w:val="24"/>
+        </w:rPr>
+        <w:t xml:space="preserve">eloped using </w:t>
+      </w:r>
+      <w:r>
+        <w:rPr>
+          <w:b/>
+          <w:sz w:val="24"/>
+          <w:szCs w:val="24"/>
+        </w:rPr>
+        <w:t xml:space="preserve">Java as backend </w:t>
       </w:r>
       <w:r>
         <w:rPr>
@@ -1028,8 +1046,6 @@
         </w:rPr>
         <w:t>Role Based Access Control</w:t>
       </w:r>
-      <w:bookmarkStart w:id="0" w:name="_GoBack"/>
-      <w:bookmarkEnd w:id="0"/>
     </w:p>
     <w:p>
       <w:pPr>
@@ -1048,21 +1064,7 @@
           <w:sz w:val="24"/>
           <w:szCs w:val="24"/>
         </w:rPr>
-        <w:t xml:space="preserve"> </w:t>
-      </w:r>
-      <w:r>
-        <w:rPr>
-          <w:sz w:val="24"/>
-          <w:szCs w:val="24"/>
-        </w:rPr>
-        <w:t>Question Ban</w:t>
-      </w:r>
-      <w:r>
-        <w:rPr>
-          <w:sz w:val="24"/>
-          <w:szCs w:val="24"/>
-        </w:rPr>
-        <w:t xml:space="preserve">k and </w:t>
+        <w:t xml:space="preserve">Question Bank and </w:t>
       </w:r>
       <w:r>
         <w:rPr>

</xml_diff>